<commit_message>
Fix accessibility for next steps documents
</commit_message>
<xml_diff>
--- a/docassemble/MAMotionToVacateDefaultJudgmentForLackOfNotice/data/templates/motion_to_vacate_default_judgment_next_steps.docx
+++ b/docassemble/MAMotionToVacateDefaultJudgmentForLackOfNotice/data/templates/motion_to_vacate_default_judgment_next_steps.docx
@@ -3,43 +3,14 @@
 <w:document xmlns:wpc="http://schemas.microsoft.com/office/word/2010/wordprocessingCanvas" xmlns:cx="http://schemas.microsoft.com/office/drawing/2014/chartex" xmlns:cx1="http://schemas.microsoft.com/office/drawing/2015/9/8/chartex" xmlns:cx2="http://schemas.microsoft.com/office/drawing/2015/10/21/chartex" xmlns:cx3="http://schemas.microsoft.com/office/drawing/2016/5/9/chartex" xmlns:cx4="http://schemas.microsoft.com/office/drawing/2016/5/10/chartex" xmlns:cx5="http://schemas.microsoft.com/office/drawing/2016/5/11/chartex" xmlns:cx6="http://schemas.microsoft.com/office/drawing/2016/5/12/chartex" xmlns:cx7="http://schemas.microsoft.com/office/drawing/2016/5/13/chartex" xmlns:cx8="http://schemas.microsoft.com/office/drawing/2016/5/14/chartex" xmlns:mc="http://schemas.openxmlformats.org/markup-compatibility/2006" xmlns:aink="http://schemas.microsoft.com/office/drawing/2016/ink" xmlns:am3d="http://schemas.microsoft.com/office/drawing/2017/model3d" xmlns:o="urn:schemas-microsoft-com:office:office" xmlns:oel="http://schemas.microsoft.com/office/2019/extlst" xmlns:r="http://schemas.openxmlformats.org/officeDocument/2006/relationships" xmlns:m="http://schemas.openxmlformats.org/officeDocument/2006/math" xmlns:v="urn:schemas-microsoft-com:vml" xmlns:wp14="http://schemas.microsoft.com/office/word/2010/wordprocessingDrawing" xmlns:wp="http://schemas.openxmlformats.org/drawingml/2006/wordprocessingDrawing" xmlns:w10="urn:schemas-microsoft-com:office:word" xmlns:w="http://schemas.openxmlformats.org/wordprocessingml/2006/main" xmlns:w14="http://schemas.microsoft.com/office/word/2010/wordml" xmlns:w15="http://schemas.microsoft.com/office/word/2012/wordml" xmlns:w16cex="http://schemas.microsoft.com/office/word/2018/wordml/cex" xmlns:w16cid="http://schemas.microsoft.com/office/word/2016/wordml/cid" xmlns:w16="http://schemas.microsoft.com/office/word/2018/wordml" xmlns:w16du="http://schemas.microsoft.com/office/word/2023/wordml/word16du" xmlns:w16sdtdh="http://schemas.microsoft.com/office/word/2020/wordml/sdtdatahash" xmlns:w16se="http://schemas.microsoft.com/office/word/2015/wordml/symex" xmlns:wpg="http://schemas.microsoft.com/office/word/2010/wordprocessingGroup" xmlns:wpi="http://schemas.microsoft.com/office/word/2010/wordprocessingInk" xmlns:wne="http://schemas.microsoft.com/office/word/2006/wordml" xmlns:wps="http://schemas.microsoft.com/office/word/2010/wordprocessingShape" mc:Ignorable="w14 w15 w16se w16cid w16 w16cex w16sdtdh w16du wp14">
   <w:background w:color="FFFFFF"/>
   <w:body>
-    <w:tbl>
-      <w:tblPr>
-        <w:tblStyle w:val="TableGrid"/>
-        <w:tblW w:w="10790" w:type="dxa"/>
-        <w:tblCellMar>
-          <w:top w:w="115" w:type="dxa"/>
-          <w:left w:w="115" w:type="dxa"/>
-          <w:bottom w:w="115" w:type="dxa"/>
-          <w:right w:w="115" w:type="dxa"/>
-        </w:tblCellMar>
-        <w:tblLook w:val="04A0" w:firstRow="1" w:lastRow="0" w:firstColumn="1" w:lastColumn="0" w:noHBand="0" w:noVBand="1"/>
-      </w:tblPr>
-      <w:tblGrid>
-        <w:gridCol w:w="10790"/>
-      </w:tblGrid>
-      <w:tr>
-        <w:tc>
-          <w:tcPr>
-            <w:tcW w:w="10790" w:type="dxa"/>
-            <w:shd w:val="clear" w:color="auto" w:fill="17406D" w:themeFill="text2"/>
-          </w:tcPr>
-          <w:p>
-            <w:pPr>
-              <w:pStyle w:val="Title"/>
-              <w:spacing w:after="0"/>
-              <w:jc w:val="center"/>
-            </w:pPr>
-            <w:r>
-              <w:rPr>
-                <w:color w:val="FFFFFF" w:themeColor="background1"/>
-              </w:rPr>
-              <w:t>File a Motion to Vacate Default Judgment for Lack of Notice</w:t>
-            </w:r>
-          </w:p>
-        </w:tc>
-      </w:tr>
-    </w:tbl>
+    <w:p>
+      <w:pPr>
+        <w:pStyle w:val="Title"/>
+      </w:pPr>
+      <w:r>
+        <w:t>File a Motion to Vacate Default Judgment for Lack of Notice</w:t>
+      </w:r>
+    </w:p>
     <w:p>
       <w:pPr>
         <w:rPr>
@@ -2611,6 +2582,7 @@
       <w:bCs/>
       <w:i/>
       <w:iCs/>
+      <w:color w:val="17406D"/>
       <w:sz w:val="32"/>
       <w:szCs w:val="32"/>
     </w:rPr>
@@ -2635,7 +2607,7 @@
       <w:rFonts w:asciiTheme="majorHAnsi" w:eastAsiaTheme="majorEastAsia" w:hAnsiTheme="majorHAnsi" w:cstheme="majorBidi"/>
       <w:b/>
       <w:bCs/>
-      <w:color w:val="0074F1"/>
+      <w:color w:val="17406D"/>
       <w:sz w:val="24"/>
       <w:szCs w:val="24"/>
     </w:rPr>
@@ -2657,6 +2629,7 @@
       <w:rFonts w:asciiTheme="majorHAnsi" w:eastAsiaTheme="majorEastAsia" w:hAnsiTheme="majorHAnsi" w:cstheme="majorBidi"/>
       <w:b/>
       <w:bCs/>
+      <w:color w:val="17406D"/>
       <w:sz w:val="21"/>
       <w:szCs w:val="21"/>
     </w:rPr>
@@ -2680,6 +2653,7 @@
       <w:bCs/>
       <w:i/>
       <w:iCs/>
+      <w:color w:val="17406D"/>
       <w:sz w:val="24"/>
       <w:szCs w:val="24"/>
     </w:rPr>
@@ -3254,11 +3228,19 @@
     <w:uiPriority w:val="10"/>
     <w:qFormat/>
     <w:rsid w:val="00F47A36"/>
+    <w:pPr>
+      <w:jc w:val="center"/>
+      <w:shd w:val="clear" w:color="auto" w:fill="17406D"/>
+      <w:pBdr>
+        <w:top w:val="single" w:sz="48" w:space="1" w:color="17406D"/>
+        <w:bottom w:val="single" w:sz="48" w:space="1" w:color="17406D"/>
+      </w:pBdr>
+    </w:pPr>
     <w:rPr>
       <w:rFonts w:asciiTheme="majorHAnsi" w:eastAsiaTheme="majorEastAsia" w:hAnsiTheme="majorHAnsi" w:cstheme="majorBidi"/>
       <w:b/>
       <w:bCs/>
-      <w:color w:val="002E63"/>
+      <w:color w:val="FFFFFF"/>
       <w:spacing w:val="10"/>
       <w:sz w:val="36"/>
       <w:szCs w:val="36"/>

</xml_diff>